<commit_message>
ENGG 27 & 151 | Slight updates
</commit_message>
<xml_diff>
--- a/ENGG 151/Project 2/DOCS N SUBS/Estacio_ProgressReport2.docx
+++ b/ENGG 151/Project 2/DOCS N SUBS/Estacio_ProgressReport2.docx
@@ -155,7 +155,15 @@
           <w:b/>
           <w:bCs/>
         </w:rPr>
-        <w:t>March 4</w:t>
+        <w:t xml:space="preserve">March </w:t>
+      </w:r>
+      <w:r>
+        <w:rPr>
+          <w:rFonts w:ascii="Liberation Serif" w:hAnsi="Liberation Serif"/>
+          <w:b/>
+          <w:bCs/>
+        </w:rPr>
+        <w:t>11</w:t>
       </w:r>
       <w:r>
         <w:rPr>
@@ -199,7 +207,15 @@
           <w:b/>
           <w:bCs/>
         </w:rPr>
-        <w:t xml:space="preserve"> 2</w:t>
+        <w:t xml:space="preserve"> </w:t>
+      </w:r>
+      <w:r>
+        <w:rPr>
+          <w:rFonts w:ascii="Liberation Serif" w:hAnsi="Liberation Serif"/>
+          <w:b/>
+          <w:bCs/>
+        </w:rPr>
+        <w:t>3</w:t>
       </w:r>
       <w:r>
         <w:rPr>
@@ -269,7 +285,13 @@
         <w:rPr>
           <w:rFonts w:ascii="Liberation Serif" w:hAnsi="Liberation Serif"/>
         </w:rPr>
-        <w:t>March 4</w:t>
+        <w:t xml:space="preserve">March </w:t>
+      </w:r>
+      <w:r>
+        <w:rPr>
+          <w:rFonts w:ascii="Liberation Serif" w:hAnsi="Liberation Serif"/>
+        </w:rPr>
+        <w:t>11</w:t>
       </w:r>
       <w:r>
         <w:rPr>
@@ -287,59 +309,89 @@
         <w:rPr>
           <w:rFonts w:ascii="Liberation Serif" w:hAnsi="Liberation Serif"/>
         </w:rPr>
-        <w:t>no additional progress has been made since the first progress report. As such, f</w:t>
-      </w:r>
-      <w:r>
-        <w:rPr>
-          <w:rFonts w:ascii="Liberation Serif" w:hAnsi="Liberation Serif"/>
-        </w:rPr>
-        <w:t xml:space="preserve">urther work </w:t>
-      </w:r>
-      <w:r>
-        <w:rPr>
-          <w:rFonts w:ascii="Liberation Serif" w:hAnsi="Liberation Serif"/>
-        </w:rPr>
-        <w:t xml:space="preserve">still </w:t>
-      </w:r>
-      <w:r>
-        <w:rPr>
-          <w:rFonts w:ascii="Liberation Serif" w:hAnsi="Liberation Serif"/>
-        </w:rPr>
-        <w:t xml:space="preserve">includes accepting arguments when </w:t>
-      </w:r>
-      <w:proofErr w:type="gramStart"/>
-      <w:r>
-        <w:rPr>
-          <w:rFonts w:ascii="Liberation Serif" w:hAnsi="Liberation Serif"/>
-        </w:rPr>
-        <w:t>run</w:t>
-      </w:r>
-      <w:proofErr w:type="gramEnd"/>
-      <w:r>
-        <w:rPr>
-          <w:rFonts w:ascii="Liberation Serif" w:hAnsi="Liberation Serif"/>
-        </w:rPr>
-        <w:t xml:space="preserve"> from the command line, </w:t>
-      </w:r>
-      <w:proofErr w:type="gramStart"/>
-      <w:r>
-        <w:rPr>
-          <w:rFonts w:ascii="Liberation Serif" w:hAnsi="Liberation Serif"/>
-        </w:rPr>
-        <w:t>file</w:t>
-      </w:r>
-      <w:proofErr w:type="gramEnd"/>
-      <w:r>
-        <w:rPr>
-          <w:rFonts w:ascii="Liberation Serif" w:hAnsi="Liberation Serif"/>
-        </w:rPr>
-        <w:t xml:space="preserve"> output according to specifications, </w:t>
-      </w:r>
-      <w:r>
-        <w:rPr>
-          <w:rFonts w:ascii="Liberation Serif" w:hAnsi="Liberation Serif"/>
-        </w:rPr>
-        <w:t xml:space="preserve">and implementing output to console for only calculations with 10 steps or less. </w:t>
+        <w:t>major progress</w:t>
+      </w:r>
+      <w:r>
+        <w:rPr>
+          <w:rFonts w:ascii="Liberation Serif" w:hAnsi="Liberation Serif"/>
+        </w:rPr>
+        <w:t xml:space="preserve"> has been made since the </w:t>
+      </w:r>
+      <w:r>
+        <w:rPr>
+          <w:rFonts w:ascii="Liberation Serif" w:hAnsi="Liberation Serif"/>
+        </w:rPr>
+        <w:t xml:space="preserve">second </w:t>
+      </w:r>
+      <w:r>
+        <w:rPr>
+          <w:rFonts w:ascii="Liberation Serif" w:hAnsi="Liberation Serif"/>
+        </w:rPr>
+        <w:t xml:space="preserve">progress report. </w:t>
+      </w:r>
+      <w:r>
+        <w:rPr>
+          <w:rFonts w:ascii="Liberation Serif" w:hAnsi="Liberation Serif"/>
+        </w:rPr>
+        <w:t xml:space="preserve">The program can now be invoked from the command line, taking in arguments for the relevant file parameters and DFT calculations. These arguments are stored in the program and used throughout runtime for calling the </w:t>
+      </w:r>
+      <w:r>
+        <w:rPr>
+          <w:rFonts w:ascii="Liberation Mono" w:hAnsi="Liberation Mono"/>
+          <w:sz w:val="20"/>
+          <w:szCs w:val="20"/>
+        </w:rPr>
+        <w:t>computeDFT()</w:t>
+      </w:r>
+      <w:r>
+        <w:rPr>
+          <w:rFonts w:ascii="Liberation Serif" w:hAnsi="Liberation Serif"/>
+          <w:sz w:val="20"/>
+          <w:szCs w:val="20"/>
+        </w:rPr>
+        <w:t xml:space="preserve"> </w:t>
+      </w:r>
+      <w:r>
+        <w:rPr>
+          <w:rFonts w:ascii="Liberation Serif" w:hAnsi="Liberation Serif"/>
+        </w:rPr>
+        <w:t xml:space="preserve">function and to produce an output file. </w:t>
+      </w:r>
+      <w:r>
+        <w:rPr>
+          <w:rFonts w:ascii="Liberation Serif" w:hAnsi="Liberation Serif"/>
+        </w:rPr>
+        <w:t xml:space="preserve">Additionally, the program is now able to both output to console and file output. However, the logic for console output </w:t>
+      </w:r>
+      <w:r>
+        <w:rPr>
+          <w:rFonts w:ascii="Liberation Serif" w:hAnsi="Liberation Serif"/>
+        </w:rPr>
+        <w:t>only</w:t>
+      </w:r>
+      <w:r>
+        <w:rPr>
+          <w:rFonts w:ascii="Liberation Serif" w:hAnsi="Liberation Serif"/>
+        </w:rPr>
+        <w:t xml:space="preserve"> for</w:t>
+      </w:r>
+      <w:r>
+        <w:rPr>
+          <w:rFonts w:ascii="Liberation Serif" w:hAnsi="Liberation Serif"/>
+        </w:rPr>
+        <w:t xml:space="preserve"> calculations with 10 steps or less</w:t>
+      </w:r>
+      <w:r>
+        <w:rPr>
+          <w:rFonts w:ascii="Liberation Serif" w:hAnsi="Liberation Serif"/>
+        </w:rPr>
+        <w:t xml:space="preserve"> is not implemented yet. Further work includes implementing this logic and assuring that the program follows specifications.</w:t>
+      </w:r>
+      <w:r>
+        <w:rPr>
+          <w:rFonts w:ascii="Liberation Serif" w:hAnsi="Liberation Serif"/>
+        </w:rPr>
+        <w:t xml:space="preserve"> </w:t>
       </w:r>
       <w:r>
         <w:rPr>
@@ -408,10 +460,10 @@
           <w:noProof/>
         </w:rPr>
         <w:drawing>
-          <wp:inline distT="0" distB="0" distL="0" distR="0" wp14:anchorId="67DA7545" wp14:editId="0B6A75D3">
-            <wp:extent cx="4301145" cy="3232216"/>
-            <wp:effectExtent l="0" t="0" r="4445" b="6350"/>
-            <wp:docPr id="1270753651" name="Picture 1" descr="A screenshot of a computer&#10;&#10;AI-generated content may be incorrect."/>
+          <wp:inline distT="0" distB="0" distL="0" distR="0" wp14:anchorId="79B1167B" wp14:editId="0DE72EFF">
+            <wp:extent cx="6122035" cy="4019550"/>
+            <wp:effectExtent l="0" t="0" r="0" b="0"/>
+            <wp:docPr id="254078726" name="Picture 1"/>
             <wp:cNvGraphicFramePr>
               <a:graphicFrameLocks xmlns:a="http://schemas.openxmlformats.org/drawingml/2006/main" noChangeAspect="1"/>
             </wp:cNvGraphicFramePr>
@@ -419,7 +471,7 @@
               <a:graphicData uri="http://schemas.openxmlformats.org/drawingml/2006/picture">
                 <pic:pic xmlns:pic="http://schemas.openxmlformats.org/drawingml/2006/picture">
                   <pic:nvPicPr>
-                    <pic:cNvPr id="1270753651" name="Picture 1" descr="A screenshot of a computer&#10;&#10;AI-generated content may be incorrect."/>
+                    <pic:cNvPr id="254078726" name=""/>
                     <pic:cNvPicPr/>
                   </pic:nvPicPr>
                   <pic:blipFill>
@@ -431,7 +483,7 @@
                   <pic:spPr>
                     <a:xfrm>
                       <a:off x="0" y="0"/>
-                      <a:ext cx="4302970" cy="3233588"/>
+                      <a:ext cx="6122035" cy="4019550"/>
                     </a:xfrm>
                     <a:prstGeom prst="rect">
                       <a:avLst/>
@@ -443,6 +495,12 @@
           </wp:inline>
         </w:drawing>
       </w:r>
+      <w:r>
+        <w:rPr>
+          <w:noProof/>
+        </w:rPr>
+        <w:t xml:space="preserve"> </w:t>
+      </w:r>
     </w:p>
     <w:p>
       <w:pPr>
@@ -482,11 +540,12 @@
         <w:rPr>
           <w:noProof/>
         </w:rPr>
+        <w:lastRenderedPageBreak/>
         <w:drawing>
-          <wp:inline distT="0" distB="0" distL="0" distR="0" wp14:anchorId="359E46EE" wp14:editId="1413DAED">
-            <wp:extent cx="6122035" cy="742315"/>
-            <wp:effectExtent l="0" t="0" r="0" b="635"/>
-            <wp:docPr id="1036507258" name="Picture 1"/>
+          <wp:inline distT="0" distB="0" distL="0" distR="0" wp14:anchorId="16722158" wp14:editId="3375F1D4">
+            <wp:extent cx="6122035" cy="731520"/>
+            <wp:effectExtent l="0" t="0" r="0" b="0"/>
+            <wp:docPr id="324683389" name="Picture 1"/>
             <wp:cNvGraphicFramePr>
               <a:graphicFrameLocks xmlns:a="http://schemas.openxmlformats.org/drawingml/2006/main" noChangeAspect="1"/>
             </wp:cNvGraphicFramePr>
@@ -494,7 +553,7 @@
               <a:graphicData uri="http://schemas.openxmlformats.org/drawingml/2006/picture">
                 <pic:pic xmlns:pic="http://schemas.openxmlformats.org/drawingml/2006/picture">
                   <pic:nvPicPr>
-                    <pic:cNvPr id="1036507258" name=""/>
+                    <pic:cNvPr id="324683389" name=""/>
                     <pic:cNvPicPr/>
                   </pic:nvPicPr>
                   <pic:blipFill>
@@ -506,7 +565,7 @@
                   <pic:spPr>
                     <a:xfrm>
                       <a:off x="0" y="0"/>
-                      <a:ext cx="6122035" cy="742315"/>
+                      <a:ext cx="6122035" cy="731520"/>
                     </a:xfrm>
                     <a:prstGeom prst="rect">
                       <a:avLst/>
@@ -524,6 +583,12 @@
         </w:rPr>
         <w:t xml:space="preserve"> </w:t>
       </w:r>
+      <w:r>
+        <w:rPr>
+          <w:noProof/>
+        </w:rPr>
+        <w:t xml:space="preserve"> </w:t>
+      </w:r>
     </w:p>
     <w:p>
       <w:pPr>
@@ -558,7 +623,6 @@
         <w:rPr>
           <w:noProof/>
         </w:rPr>
-        <w:lastRenderedPageBreak/>
         <w:drawing>
           <wp:inline distT="0" distB="0" distL="0" distR="0" wp14:anchorId="3505E814" wp14:editId="662A2CC6">
             <wp:extent cx="6071094" cy="1591294"/>
@@ -609,19 +673,11 @@
         </w:rPr>
         <w:t xml:space="preserve">compiler version – </w:t>
       </w:r>
-      <w:proofErr w:type="spellStart"/>
-      <w:r>
-        <w:rPr>
-          <w:rFonts w:ascii="Liberation Serif" w:hAnsi="Liberation Serif"/>
-        </w:rPr>
-        <w:t>gcc</w:t>
-      </w:r>
-      <w:proofErr w:type="spellEnd"/>
-      <w:r>
-        <w:rPr>
-          <w:rFonts w:ascii="Liberation Serif" w:hAnsi="Liberation Serif"/>
-        </w:rPr>
-        <w:t xml:space="preserve"> version 15.2.0 (Rev8, Built by MSYS2 project)</w:t>
+      <w:r>
+        <w:rPr>
+          <w:rFonts w:ascii="Liberation Serif" w:hAnsi="Liberation Serif"/>
+        </w:rPr>
+        <w:t>gcc version 15.2.0 (Rev8, Built by MSYS2 project)</w:t>
       </w:r>
     </w:p>
     <w:p>
@@ -644,10 +700,10 @@
           <w:noProof/>
         </w:rPr>
         <w:drawing>
-          <wp:inline distT="0" distB="0" distL="0" distR="0" wp14:anchorId="5DEEFF7C" wp14:editId="33D4E5B7">
-            <wp:extent cx="3874725" cy="1549730"/>
-            <wp:effectExtent l="0" t="0" r="0" b="0"/>
-            <wp:docPr id="96672569" name="Picture 1" descr="A screenshot of a computer program&#10;&#10;AI-generated content may be incorrect."/>
+          <wp:inline distT="0" distB="0" distL="0" distR="0" wp14:anchorId="2BF3033A" wp14:editId="333E7B40">
+            <wp:extent cx="3670300" cy="2226469"/>
+            <wp:effectExtent l="0" t="0" r="6350" b="2540"/>
+            <wp:docPr id="1953822906" name="Picture 1"/>
             <wp:cNvGraphicFramePr>
               <a:graphicFrameLocks xmlns:a="http://schemas.openxmlformats.org/drawingml/2006/main" noChangeAspect="1"/>
             </wp:cNvGraphicFramePr>
@@ -655,7 +711,7 @@
               <a:graphicData uri="http://schemas.openxmlformats.org/drawingml/2006/picture">
                 <pic:pic xmlns:pic="http://schemas.openxmlformats.org/drawingml/2006/picture">
                   <pic:nvPicPr>
-                    <pic:cNvPr id="96672569" name="Picture 1" descr="A screenshot of a computer program&#10;&#10;AI-generated content may be incorrect."/>
+                    <pic:cNvPr id="1953822906" name=""/>
                     <pic:cNvPicPr/>
                   </pic:nvPicPr>
                   <pic:blipFill>
@@ -667,7 +723,7 @@
                   <pic:spPr>
                     <a:xfrm>
                       <a:off x="0" y="0"/>
-                      <a:ext cx="3890728" cy="1556130"/>
+                      <a:ext cx="3676655" cy="2230324"/>
                     </a:xfrm>
                     <a:prstGeom prst="rect">
                       <a:avLst/>
@@ -679,6 +735,12 @@
           </wp:inline>
         </w:drawing>
       </w:r>
+      <w:r>
+        <w:rPr>
+          <w:noProof/>
+        </w:rPr>
+        <w:t xml:space="preserve"> </w:t>
+      </w:r>
     </w:p>
     <w:p>
       <w:pPr>
@@ -721,7 +783,13 @@
         <w:rPr>
           <w:rFonts w:ascii="Liberation Serif" w:hAnsi="Liberation Serif"/>
         </w:rPr>
-        <w:t>7623</w:t>
+        <w:t>7</w:t>
+      </w:r>
+      <w:r>
+        <w:rPr>
+          <w:rFonts w:ascii="Liberation Serif" w:hAnsi="Liberation Serif"/>
+        </w:rPr>
+        <w:t>840</w:t>
       </w:r>
     </w:p>
     <w:p>
@@ -736,10 +804,10 @@
           <w:noProof/>
         </w:rPr>
         <w:drawing>
-          <wp:inline distT="0" distB="0" distL="0" distR="0" wp14:anchorId="0FF23CB3" wp14:editId="02033F1A">
-            <wp:extent cx="2897579" cy="1752955"/>
+          <wp:inline distT="0" distB="0" distL="0" distR="0" wp14:anchorId="316617EC" wp14:editId="7F14824A">
+            <wp:extent cx="2806700" cy="2174628"/>
             <wp:effectExtent l="0" t="0" r="0" b="0"/>
-            <wp:docPr id="83190705" name="Picture 1" descr="A screenshot of a computer program&#10;&#10;AI-generated content may be incorrect."/>
+            <wp:docPr id="1129540867" name="Picture 1"/>
             <wp:cNvGraphicFramePr>
               <a:graphicFrameLocks xmlns:a="http://schemas.openxmlformats.org/drawingml/2006/main" noChangeAspect="1"/>
             </wp:cNvGraphicFramePr>
@@ -747,7 +815,7 @@
               <a:graphicData uri="http://schemas.openxmlformats.org/drawingml/2006/picture">
                 <pic:pic xmlns:pic="http://schemas.openxmlformats.org/drawingml/2006/picture">
                   <pic:nvPicPr>
-                    <pic:cNvPr id="83190705" name="Picture 1" descr="A screenshot of a computer program&#10;&#10;AI-generated content may be incorrect."/>
+                    <pic:cNvPr id="1129540867" name=""/>
                     <pic:cNvPicPr/>
                   </pic:nvPicPr>
                   <pic:blipFill>
@@ -759,7 +827,7 @@
                   <pic:spPr>
                     <a:xfrm>
                       <a:off x="0" y="0"/>
-                      <a:ext cx="2902436" cy="1755894"/>
+                      <a:ext cx="2810338" cy="2177447"/>
                     </a:xfrm>
                     <a:prstGeom prst="rect">
                       <a:avLst/>
@@ -771,6 +839,12 @@
           </wp:inline>
         </w:drawing>
       </w:r>
+      <w:r>
+        <w:rPr>
+          <w:noProof/>
+        </w:rPr>
+        <w:t xml:space="preserve"> </w:t>
+      </w:r>
     </w:p>
     <w:p>
       <w:pPr>
@@ -783,21 +857,19 @@
         <w:rPr>
           <w:rFonts w:ascii="Liberation Serif" w:hAnsi="Liberation Serif"/>
         </w:rPr>
-        <w:t xml:space="preserve">IDE – Visual Studio Code </w:t>
-      </w:r>
-      <w:proofErr w:type="spellStart"/>
-      <w:r>
-        <w:rPr>
-          <w:rFonts w:ascii="Liberation Serif" w:hAnsi="Liberation Serif"/>
-        </w:rPr>
-        <w:t>ver</w:t>
-      </w:r>
-      <w:proofErr w:type="spellEnd"/>
-      <w:r>
-        <w:rPr>
-          <w:rFonts w:ascii="Liberation Serif" w:hAnsi="Liberation Serif"/>
-        </w:rPr>
-        <w:t xml:space="preserve"> 1.105.1</w:t>
+        <w:t>IDE – Visual Studio Code ver 1.1</w:t>
+      </w:r>
+      <w:r>
+        <w:rPr>
+          <w:rFonts w:ascii="Liberation Serif" w:hAnsi="Liberation Serif"/>
+        </w:rPr>
+        <w:t>10</w:t>
+      </w:r>
+      <w:r>
+        <w:rPr>
+          <w:rFonts w:ascii="Liberation Serif" w:hAnsi="Liberation Serif"/>
+        </w:rPr>
+        <w:t>.1</w:t>
       </w:r>
     </w:p>
     <w:sectPr>

</xml_diff>